<commit_message>
[PLAN-graphify-research] Bước 3.2: cập nhật RESEARCH §8 + plan file sau áp dụng G1-G5
- RESEARCH-graphify-2026-07-18.md §8: đổi G1-G5 từ [chờ] → ✅ Đã áp dụng
  kèm chi tiết kết quả từng đề xuất
- RESEARCH-graphify-2026-07-18.docx: xuất lại sau cập nhật §8
- PLAN-graphify-research-2026-07-18.md:
    Bước 3.1 ✅ (user xác nhận G1-G5)
    Bước 3.2 ✅ (áp dụng xong)
    Handoff Log Bước 3.2 ghi đầy đủ
    Artifacts checklist cập nhật

Plan: .claude/plans/PLAN-graphify-research-2026-07-18.md
</commit_message>
<xml_diff>
--- a/docs/research/RESEARCH-graphify-2026-07-18.docx
+++ b/docs/research/RESEARCH-graphify-2026-07-18.docx
@@ -62,6 +62,17 @@
         <w:rPr>
           <w:sz w:val="21"/>
         </w:rPr>
+        <w:t>applied: 2026-07-19</w:t>
+      </w:r>
+    </w:p>
+    <w:p>
+      <w:pPr>
+        <w:spacing w:after="80"/>
+      </w:pPr>
+      <w:r>
+        <w:rPr>
+          <w:sz w:val="21"/>
+        </w:rPr>
         <w:t>researcher: github-repo-researcher</w:t>
       </w:r>
     </w:p>
@@ -84,7 +95,7 @@
         <w:rPr>
           <w:sz w:val="21"/>
         </w:rPr>
-        <w:t>status: draft — awaiting user selection (Bước 3b hoàn thành)</w:t>
+        <w:t>status: applied — G1-G5 đã áp dụng (2026-07-19), chờ user xác nhận merge</w:t>
       </w:r>
     </w:p>
     <w:p>
@@ -5646,14 +5657,15 @@
         <w:tblLook w:firstColumn="1" w:firstRow="1" w:lastColumn="0" w:lastRow="0" w:noHBand="0" w:noVBand="1" w:val="04A0"/>
       </w:tblPr>
       <w:tblGrid>
-        <w:gridCol w:w="3230"/>
-        <w:gridCol w:w="3230"/>
-        <w:gridCol w:w="3230"/>
+        <w:gridCol w:w="2422"/>
+        <w:gridCol w:w="2422"/>
+        <w:gridCol w:w="2422"/>
+        <w:gridCol w:w="2422"/>
       </w:tblGrid>
       <w:tr>
         <w:tc>
           <w:tcPr>
-            <w:tcW w:type="dxa" w:w="3230"/>
+            <w:tcW w:type="dxa" w:w="2422"/>
             <w:shd w:val="clear" w:color="auto" w:fill="251C53"/>
             <w:tcBorders>
               <w:top w:val="single" w:sz="4" w:space="0" w:color="251C53"/>
@@ -5675,7 +5687,7 @@
         </w:tc>
         <w:tc>
           <w:tcPr>
-            <w:tcW w:type="dxa" w:w="3230"/>
+            <w:tcW w:type="dxa" w:w="2422"/>
             <w:shd w:val="clear" w:color="auto" w:fill="251C53"/>
             <w:tcBorders>
               <w:top w:val="single" w:sz="4" w:space="0" w:color="251C53"/>
@@ -5697,7 +5709,7 @@
         </w:tc>
         <w:tc>
           <w:tcPr>
-            <w:tcW w:type="dxa" w:w="3230"/>
+            <w:tcW w:type="dxa" w:w="2422"/>
             <w:shd w:val="clear" w:color="auto" w:fill="251C53"/>
             <w:tcBorders>
               <w:top w:val="single" w:sz="4" w:space="0" w:color="251C53"/>
@@ -5717,11 +5729,33 @@
             </w:r>
           </w:p>
         </w:tc>
+        <w:tc>
+          <w:tcPr>
+            <w:tcW w:type="dxa" w:w="2422"/>
+            <w:shd w:val="clear" w:color="auto" w:fill="251C53"/>
+            <w:tcBorders>
+              <w:top w:val="single" w:sz="4" w:space="0" w:color="251C53"/>
+              <w:left w:val="single" w:sz="4" w:space="0" w:color="251C53"/>
+              <w:bottom w:val="single" w:sz="4" w:space="0" w:color="251C53"/>
+              <w:right w:val="single" w:sz="4" w:space="0" w:color="251C53"/>
+            </w:tcBorders>
+          </w:tcPr>
+          <w:p>
+            <w:r>
+              <w:rPr>
+                <w:b/>
+                <w:color w:val="FFFFFF"/>
+                <w:sz w:val="20"/>
+              </w:rPr>
+              <w:t>Chi tiết</w:t>
+            </w:r>
+          </w:p>
+        </w:tc>
       </w:tr>
       <w:tr>
         <w:tc>
           <w:tcPr>
-            <w:tcW w:type="dxa" w:w="3230"/>
+            <w:tcW w:type="dxa" w:w="2422"/>
             <w:tcBorders>
               <w:top w:val="single" w:sz="4" w:space="0" w:color="CBCBCB"/>
               <w:left w:val="single" w:sz="4" w:space="0" w:color="CBCBCB"/>
@@ -5740,7 +5774,7 @@
         </w:tc>
         <w:tc>
           <w:tcPr>
-            <w:tcW w:type="dxa" w:w="3230"/>
+            <w:tcW w:type="dxa" w:w="2422"/>
             <w:tcBorders>
               <w:top w:val="single" w:sz="4" w:space="0" w:color="CBCBCB"/>
               <w:left w:val="single" w:sz="4" w:space="0" w:color="CBCBCB"/>
@@ -5759,7 +5793,7 @@
         </w:tc>
         <w:tc>
           <w:tcPr>
-            <w:tcW w:type="dxa" w:w="3230"/>
+            <w:tcW w:type="dxa" w:w="2422"/>
             <w:tcBorders>
               <w:top w:val="single" w:sz="4" w:space="0" w:color="CBCBCB"/>
               <w:left w:val="single" w:sz="4" w:space="0" w:color="CBCBCB"/>
@@ -5776,11 +5810,30 @@
             </w:r>
           </w:p>
         </w:tc>
+        <w:tc>
+          <w:tcPr>
+            <w:tcW w:type="dxa" w:w="2422"/>
+            <w:tcBorders>
+              <w:top w:val="single" w:sz="4" w:space="0" w:color="CBCBCB"/>
+              <w:left w:val="single" w:sz="4" w:space="0" w:color="CBCBCB"/>
+              <w:bottom w:val="single" w:sz="4" w:space="0" w:color="CBCBCB"/>
+              <w:right w:val="single" w:sz="4" w:space="0" w:color="CBCBCB"/>
+            </w:tcBorders>
+          </w:tcPr>
+          <w:p>
+            <w:r>
+              <w:rPr>
+                <w:sz w:val="20"/>
+              </w:rPr>
+              <w:t>---------</w:t>
+            </w:r>
+          </w:p>
+        </w:tc>
       </w:tr>
       <w:tr>
         <w:tc>
           <w:tcPr>
-            <w:tcW w:type="dxa" w:w="3230"/>
+            <w:tcW w:type="dxa" w:w="2422"/>
             <w:shd w:val="clear" w:color="auto" w:fill="B8B3D6"/>
             <w:tcBorders>
               <w:top w:val="single" w:sz="4" w:space="0" w:color="CBCBCB"/>
@@ -5800,7 +5853,7 @@
         </w:tc>
         <w:tc>
           <w:tcPr>
-            <w:tcW w:type="dxa" w:w="3230"/>
+            <w:tcW w:type="dxa" w:w="2422"/>
             <w:shd w:val="clear" w:color="auto" w:fill="B8B3D6"/>
             <w:tcBorders>
               <w:top w:val="single" w:sz="4" w:space="0" w:color="CBCBCB"/>
@@ -5820,7 +5873,7 @@
         </w:tc>
         <w:tc>
           <w:tcPr>
-            <w:tcW w:type="dxa" w:w="3230"/>
+            <w:tcW w:type="dxa" w:w="2422"/>
             <w:shd w:val="clear" w:color="auto" w:fill="B8B3D6"/>
             <w:tcBorders>
               <w:top w:val="single" w:sz="4" w:space="0" w:color="CBCBCB"/>
@@ -5834,7 +5887,105 @@
               <w:rPr>
                 <w:sz w:val="20"/>
               </w:rPr>
-              <w:t>⬜ Chờ user chọn (Bước 4)</w:t>
+              <w:t>✅ Đã áp dụng</w:t>
+            </w:r>
+          </w:p>
+        </w:tc>
+        <w:tc>
+          <w:tcPr>
+            <w:tcW w:type="dxa" w:w="2422"/>
+            <w:shd w:val="clear" w:color="auto" w:fill="B8B3D6"/>
+            <w:tcBorders>
+              <w:top w:val="single" w:sz="4" w:space="0" w:color="CBCBCB"/>
+              <w:left w:val="single" w:sz="4" w:space="0" w:color="CBCBCB"/>
+              <w:bottom w:val="single" w:sz="4" w:space="0" w:color="CBCBCB"/>
+              <w:right w:val="single" w:sz="4" w:space="0" w:color="CBCBCB"/>
+            </w:tcBorders>
+          </w:tcPr>
+          <w:p>
+            <w:r>
+              <w:rPr>
+                <w:rFonts w:ascii="Courier New" w:hAnsi="Courier New"/>
+                <w:color w:val="F05922"/>
+                <w:sz w:val="20"/>
+              </w:rPr>
+              <w:t>pip install graphifyy</w:t>
+            </w:r>
+            <w:r>
+              <w:rPr>
+                <w:sz w:val="20"/>
+              </w:rPr>
+              <w:t xml:space="preserve"> thành công (v0.9.20). Chạy </w:t>
+            </w:r>
+            <w:r>
+              <w:rPr>
+                <w:rFonts w:ascii="Courier New" w:hAnsi="Courier New"/>
+                <w:color w:val="F05922"/>
+                <w:sz w:val="20"/>
+              </w:rPr>
+              <w:t>graphify .</w:t>
+            </w:r>
+            <w:r>
+              <w:rPr>
+                <w:sz w:val="20"/>
+              </w:rPr>
+              <w:t xml:space="preserve"> trong </w:t>
+            </w:r>
+            <w:r>
+              <w:rPr>
+                <w:rFonts w:ascii="Courier New" w:hAnsi="Courier New"/>
+                <w:color w:val="F05922"/>
+                <w:sz w:val="20"/>
+              </w:rPr>
+              <w:t>KztekComponent/</w:t>
+            </w:r>
+            <w:r>
+              <w:rPr>
+                <w:sz w:val="20"/>
+              </w:rPr>
+              <w:t xml:space="preserve"> → </w:t>
+            </w:r>
+            <w:r>
+              <w:rPr>
+                <w:rFonts w:ascii="Courier New" w:hAnsi="Courier New"/>
+                <w:color w:val="F05922"/>
+                <w:sz w:val="20"/>
+              </w:rPr>
+              <w:t>graphify-out/graph.json</w:t>
+            </w:r>
+            <w:r>
+              <w:rPr>
+                <w:sz w:val="20"/>
+              </w:rPr>
+              <w:t xml:space="preserve"> (511 nodes, 814 edges, 31 communities). Thêm </w:t>
+            </w:r>
+            <w:r>
+              <w:rPr>
+                <w:rFonts w:ascii="Courier New" w:hAnsi="Courier New"/>
+                <w:color w:val="F05922"/>
+                <w:sz w:val="20"/>
+              </w:rPr>
+              <w:t>graphify-out/</w:t>
+            </w:r>
+            <w:r>
+              <w:rPr>
+                <w:sz w:val="20"/>
+              </w:rPr>
+              <w:t xml:space="preserve"> vào </w:t>
+            </w:r>
+            <w:r>
+              <w:rPr>
+                <w:rFonts w:ascii="Courier New" w:hAnsi="Courier New"/>
+                <w:color w:val="F05922"/>
+                <w:sz w:val="20"/>
+              </w:rPr>
+              <w:t>KztekComponent/.gitignore</w:t>
+            </w:r>
+            <w:r>
+              <w:rPr>
+                <w:sz w:val="20"/>
+              </w:rPr>
+              <w:t>.</w:t>
             </w:r>
           </w:p>
         </w:tc>
@@ -5842,7 +5993,7 @@
       <w:tr>
         <w:tc>
           <w:tcPr>
-            <w:tcW w:type="dxa" w:w="3230"/>
+            <w:tcW w:type="dxa" w:w="2422"/>
             <w:tcBorders>
               <w:top w:val="single" w:sz="4" w:space="0" w:color="CBCBCB"/>
               <w:left w:val="single" w:sz="4" w:space="0" w:color="CBCBCB"/>
@@ -5861,7 +6012,7 @@
         </w:tc>
         <w:tc>
           <w:tcPr>
-            <w:tcW w:type="dxa" w:w="3230"/>
+            <w:tcW w:type="dxa" w:w="2422"/>
             <w:tcBorders>
               <w:top w:val="single" w:sz="4" w:space="0" w:color="CBCBCB"/>
               <w:left w:val="single" w:sz="4" w:space="0" w:color="CBCBCB"/>
@@ -5880,7 +6031,7 @@
         </w:tc>
         <w:tc>
           <w:tcPr>
-            <w:tcW w:type="dxa" w:w="3230"/>
+            <w:tcW w:type="dxa" w:w="2422"/>
             <w:tcBorders>
               <w:top w:val="single" w:sz="4" w:space="0" w:color="CBCBCB"/>
               <w:left w:val="single" w:sz="4" w:space="0" w:color="CBCBCB"/>
@@ -5893,7 +6044,62 @@
               <w:rPr>
                 <w:sz w:val="20"/>
               </w:rPr>
-              <w:t>⬜ Chờ user chọn (Bước 4)</w:t>
+              <w:t>✅ Đã áp dụng</w:t>
+            </w:r>
+          </w:p>
+        </w:tc>
+        <w:tc>
+          <w:tcPr>
+            <w:tcW w:type="dxa" w:w="2422"/>
+            <w:tcBorders>
+              <w:top w:val="single" w:sz="4" w:space="0" w:color="CBCBCB"/>
+              <w:left w:val="single" w:sz="4" w:space="0" w:color="CBCBCB"/>
+              <w:bottom w:val="single" w:sz="4" w:space="0" w:color="CBCBCB"/>
+              <w:right w:val="single" w:sz="4" w:space="0" w:color="CBCBCB"/>
+            </w:tcBorders>
+          </w:tcPr>
+          <w:p>
+            <w:r>
+              <w:rPr>
+                <w:rFonts w:ascii="Courier New" w:hAnsi="Courier New"/>
+                <w:color w:val="F05922"/>
+                <w:sz w:val="20"/>
+              </w:rPr>
+              <w:t>graphify hook install</w:t>
+            </w:r>
+            <w:r>
+              <w:rPr>
+                <w:sz w:val="20"/>
+              </w:rPr>
+              <w:t xml:space="preserve"> cài post-commit hook tại </w:t>
+            </w:r>
+            <w:r>
+              <w:rPr>
+                <w:rFonts w:ascii="Courier New" w:hAnsi="Courier New"/>
+                <w:color w:val="F05922"/>
+                <w:sz w:val="20"/>
+              </w:rPr>
+              <w:t>.git/hooks/post-commit</w:t>
+            </w:r>
+            <w:r>
+              <w:rPr>
+                <w:sz w:val="20"/>
+              </w:rPr>
+              <w:t xml:space="preserve"> + post-checkout + merge driver. Hook chạy detached sau mỗi </w:t>
+            </w:r>
+            <w:r>
+              <w:rPr>
+                <w:rFonts w:ascii="Courier New" w:hAnsi="Courier New"/>
+                <w:color w:val="F05922"/>
+                <w:sz w:val="20"/>
+              </w:rPr>
+              <w:t>git commit</w:t>
+            </w:r>
+            <w:r>
+              <w:rPr>
+                <w:sz w:val="20"/>
+              </w:rPr>
+              <w:t>.</w:t>
             </w:r>
           </w:p>
         </w:tc>
@@ -5901,7 +6107,7 @@
       <w:tr>
         <w:tc>
           <w:tcPr>
-            <w:tcW w:type="dxa" w:w="3230"/>
+            <w:tcW w:type="dxa" w:w="2422"/>
             <w:shd w:val="clear" w:color="auto" w:fill="B8B3D6"/>
             <w:tcBorders>
               <w:top w:val="single" w:sz="4" w:space="0" w:color="CBCBCB"/>
@@ -5921,7 +6127,7 @@
         </w:tc>
         <w:tc>
           <w:tcPr>
-            <w:tcW w:type="dxa" w:w="3230"/>
+            <w:tcW w:type="dxa" w:w="2422"/>
             <w:shd w:val="clear" w:color="auto" w:fill="B8B3D6"/>
             <w:tcBorders>
               <w:top w:val="single" w:sz="4" w:space="0" w:color="CBCBCB"/>
@@ -5955,7 +6161,7 @@
         </w:tc>
         <w:tc>
           <w:tcPr>
-            <w:tcW w:type="dxa" w:w="3230"/>
+            <w:tcW w:type="dxa" w:w="2422"/>
             <w:shd w:val="clear" w:color="auto" w:fill="B8B3D6"/>
             <w:tcBorders>
               <w:top w:val="single" w:sz="4" w:space="0" w:color="CBCBCB"/>
@@ -5969,7 +6175,55 @@
               <w:rPr>
                 <w:sz w:val="20"/>
               </w:rPr>
-              <w:t>⬜ Chờ user chọn (Bước 4)</w:t>
+              <w:t>✅ Đã áp dụng</w:t>
+            </w:r>
+          </w:p>
+        </w:tc>
+        <w:tc>
+          <w:tcPr>
+            <w:tcW w:type="dxa" w:w="2422"/>
+            <w:shd w:val="clear" w:color="auto" w:fill="B8B3D6"/>
+            <w:tcBorders>
+              <w:top w:val="single" w:sz="4" w:space="0" w:color="CBCBCB"/>
+              <w:left w:val="single" w:sz="4" w:space="0" w:color="CBCBCB"/>
+              <w:bottom w:val="single" w:sz="4" w:space="0" w:color="CBCBCB"/>
+              <w:right w:val="single" w:sz="4" w:space="0" w:color="CBCBCB"/>
+            </w:tcBorders>
+          </w:tcPr>
+          <w:p>
+            <w:r>
+              <w:rPr>
+                <w:sz w:val="20"/>
+              </w:rPr>
+              <w:t xml:space="preserve">Thêm bước checklist vào </w:t>
+            </w:r>
+            <w:r>
+              <w:rPr>
+                <w:rFonts w:ascii="Courier New" w:hAnsi="Courier New"/>
+                <w:color w:val="F05922"/>
+                <w:sz w:val="20"/>
+              </w:rPr>
+              <w:t>.claude/agents/tech-lead.md</w:t>
+            </w:r>
+            <w:r>
+              <w:rPr>
+                <w:sz w:val="20"/>
+              </w:rPr>
+              <w:t xml:space="preserve"> — "Nếu PR sửa file C# trong KztekComponent, chạy </w:t>
+            </w:r>
+            <w:r>
+              <w:rPr>
+                <w:rFonts w:ascii="Courier New" w:hAnsi="Courier New"/>
+                <w:color w:val="F05922"/>
+                <w:sz w:val="20"/>
+              </w:rPr>
+              <w:t>graphify affected &lt;file&gt;</w:t>
+            </w:r>
+            <w:r>
+              <w:rPr>
+                <w:sz w:val="20"/>
+              </w:rPr>
+              <w:t xml:space="preserve"> và ghi kết quả vào PR comment trước khi approve."</w:t>
             </w:r>
           </w:p>
         </w:tc>
@@ -5977,7 +6231,7 @@
       <w:tr>
         <w:tc>
           <w:tcPr>
-            <w:tcW w:type="dxa" w:w="3230"/>
+            <w:tcW w:type="dxa" w:w="2422"/>
             <w:tcBorders>
               <w:top w:val="single" w:sz="4" w:space="0" w:color="CBCBCB"/>
               <w:left w:val="single" w:sz="4" w:space="0" w:color="CBCBCB"/>
@@ -5996,7 +6250,7 @@
         </w:tc>
         <w:tc>
           <w:tcPr>
-            <w:tcW w:type="dxa" w:w="3230"/>
+            <w:tcW w:type="dxa" w:w="2422"/>
             <w:tcBorders>
               <w:top w:val="single" w:sz="4" w:space="0" w:color="CBCBCB"/>
               <w:left w:val="single" w:sz="4" w:space="0" w:color="CBCBCB"/>
@@ -6015,7 +6269,7 @@
         </w:tc>
         <w:tc>
           <w:tcPr>
-            <w:tcW w:type="dxa" w:w="3230"/>
+            <w:tcW w:type="dxa" w:w="2422"/>
             <w:tcBorders>
               <w:top w:val="single" w:sz="4" w:space="0" w:color="CBCBCB"/>
               <w:left w:val="single" w:sz="4" w:space="0" w:color="CBCBCB"/>
@@ -6028,7 +6282,68 @@
               <w:rPr>
                 <w:sz w:val="20"/>
               </w:rPr>
-              <w:t>⬜ Chờ user chọn (Bước 4)</w:t>
+              <w:t>✅ Đã áp dụng</w:t>
+            </w:r>
+          </w:p>
+        </w:tc>
+        <w:tc>
+          <w:tcPr>
+            <w:tcW w:type="dxa" w:w="2422"/>
+            <w:tcBorders>
+              <w:top w:val="single" w:sz="4" w:space="0" w:color="CBCBCB"/>
+              <w:left w:val="single" w:sz="4" w:space="0" w:color="CBCBCB"/>
+              <w:bottom w:val="single" w:sz="4" w:space="0" w:color="CBCBCB"/>
+              <w:right w:val="single" w:sz="4" w:space="0" w:color="CBCBCB"/>
+            </w:tcBorders>
+          </w:tcPr>
+          <w:p>
+            <w:r>
+              <w:rPr>
+                <w:sz w:val="20"/>
+              </w:rPr>
+              <w:t xml:space="preserve">Thêm quy ước </w:t>
+            </w:r>
+            <w:r>
+              <w:rPr>
+                <w:rFonts w:ascii="Courier New" w:hAnsi="Courier New"/>
+                <w:color w:val="F05922"/>
+                <w:sz w:val="20"/>
+              </w:rPr>
+              <w:t>[EXTRACTED]</w:t>
+            </w:r>
+            <w:r>
+              <w:rPr>
+                <w:sz w:val="20"/>
+              </w:rPr>
+              <w:t>/</w:t>
+            </w:r>
+            <w:r>
+              <w:rPr>
+                <w:rFonts w:ascii="Courier New" w:hAnsi="Courier New"/>
+                <w:color w:val="F05922"/>
+                <w:sz w:val="20"/>
+              </w:rPr>
+              <w:t>[INFERRED]</w:t>
+            </w:r>
+            <w:r>
+              <w:rPr>
+                <w:sz w:val="20"/>
+              </w:rPr>
+              <w:t xml:space="preserve"> vào </w:t>
+            </w:r>
+            <w:r>
+              <w:rPr>
+                <w:rFonts w:ascii="Courier New" w:hAnsi="Courier New"/>
+                <w:color w:val="F05922"/>
+                <w:sz w:val="20"/>
+              </w:rPr>
+              <w:t>code-graph/CODE-GRAPH.md</w:t>
+            </w:r>
+            <w:r>
+              <w:rPr>
+                <w:sz w:val="20"/>
+              </w:rPr>
+              <w:t xml:space="preserve"> (giải thích ở đầu file + cột Confidence trong bảng 31 controls). Xuất lại DOCX.</w:t>
             </w:r>
           </w:p>
         </w:tc>
@@ -6036,7 +6351,7 @@
       <w:tr>
         <w:tc>
           <w:tcPr>
-            <w:tcW w:type="dxa" w:w="3230"/>
+            <w:tcW w:type="dxa" w:w="2422"/>
             <w:shd w:val="clear" w:color="auto" w:fill="B8B3D6"/>
             <w:tcBorders>
               <w:top w:val="single" w:sz="4" w:space="0" w:color="CBCBCB"/>
@@ -6056,7 +6371,7 @@
         </w:tc>
         <w:tc>
           <w:tcPr>
-            <w:tcW w:type="dxa" w:w="3230"/>
+            <w:tcW w:type="dxa" w:w="2422"/>
             <w:shd w:val="clear" w:color="auto" w:fill="B8B3D6"/>
             <w:tcBorders>
               <w:top w:val="single" w:sz="4" w:space="0" w:color="CBCBCB"/>
@@ -6076,7 +6391,7 @@
         </w:tc>
         <w:tc>
           <w:tcPr>
-            <w:tcW w:type="dxa" w:w="3230"/>
+            <w:tcW w:type="dxa" w:w="2422"/>
             <w:shd w:val="clear" w:color="auto" w:fill="B8B3D6"/>
             <w:tcBorders>
               <w:top w:val="single" w:sz="4" w:space="0" w:color="CBCBCB"/>
@@ -6090,7 +6405,97 @@
               <w:rPr>
                 <w:sz w:val="20"/>
               </w:rPr>
-              <w:t>⬜ Chờ user chọn (Bước 4)</w:t>
+              <w:t>✅ Đã áp dụng</w:t>
+            </w:r>
+          </w:p>
+        </w:tc>
+        <w:tc>
+          <w:tcPr>
+            <w:tcW w:type="dxa" w:w="2422"/>
+            <w:shd w:val="clear" w:color="auto" w:fill="B8B3D6"/>
+            <w:tcBorders>
+              <w:top w:val="single" w:sz="4" w:space="0" w:color="CBCBCB"/>
+              <w:left w:val="single" w:sz="4" w:space="0" w:color="CBCBCB"/>
+              <w:bottom w:val="single" w:sz="4" w:space="0" w:color="CBCBCB"/>
+              <w:right w:val="single" w:sz="4" w:space="0" w:color="CBCBCB"/>
+            </w:tcBorders>
+          </w:tcPr>
+          <w:p>
+            <w:r>
+              <w:rPr>
+                <w:sz w:val="20"/>
+              </w:rPr>
+              <w:t xml:space="preserve">Tạo </w:t>
+            </w:r>
+            <w:r>
+              <w:rPr>
+                <w:rFonts w:ascii="Courier New" w:hAnsi="Courier New"/>
+                <w:color w:val="F05922"/>
+                <w:sz w:val="20"/>
+              </w:rPr>
+              <w:t>scripts/skillgen_kztek.py</w:t>
+            </w:r>
+            <w:r>
+              <w:rPr>
+                <w:sz w:val="20"/>
+              </w:rPr>
+              <w:t xml:space="preserve"> (MVP ~270 dòng) + </w:t>
+            </w:r>
+            <w:r>
+              <w:rPr>
+                <w:rFonts w:ascii="Courier New" w:hAnsi="Courier New"/>
+                <w:color w:val="F05922"/>
+                <w:sz w:val="20"/>
+              </w:rPr>
+              <w:t>scripts/platforms-kztek.toml</w:t>
+            </w:r>
+            <w:r>
+              <w:rPr>
+                <w:sz w:val="20"/>
+              </w:rPr>
+              <w:t xml:space="preserve"> (3 platform: claude, cursor, kiro). Test thành công với </w:t>
+            </w:r>
+            <w:r>
+              <w:rPr>
+                <w:rFonts w:ascii="Courier New" w:hAnsi="Courier New"/>
+                <w:color w:val="F05922"/>
+                <w:sz w:val="20"/>
+              </w:rPr>
+              <w:t>verify-pr</w:t>
+            </w:r>
+            <w:r>
+              <w:rPr>
+                <w:sz w:val="20"/>
+              </w:rPr>
+              <w:t xml:space="preserve"> skill — sinh </w:t>
+            </w:r>
+            <w:r>
+              <w:rPr>
+                <w:rFonts w:ascii="Courier New" w:hAnsi="Courier New"/>
+                <w:color w:val="F05922"/>
+                <w:sz w:val="20"/>
+              </w:rPr>
+              <w:t>.cursor/rules/verify-pr.mdc</w:t>
+            </w:r>
+            <w:r>
+              <w:rPr>
+                <w:sz w:val="20"/>
+              </w:rPr>
+              <w:t xml:space="preserve"> + </w:t>
+            </w:r>
+            <w:r>
+              <w:rPr>
+                <w:rFonts w:ascii="Courier New" w:hAnsi="Courier New"/>
+                <w:color w:val="F05922"/>
+                <w:sz w:val="20"/>
+              </w:rPr>
+              <w:t>.kiro/steering/verify-pr.md</w:t>
+            </w:r>
+            <w:r>
+              <w:rPr>
+                <w:sz w:val="20"/>
+              </w:rPr>
+              <w:t>.</w:t>
             </w:r>
           </w:p>
         </w:tc>

</xml_diff>